<commit_message>
Checkpoint the author's abstract draft; flag Overleaf as authoritative
Commits the author's working edits to docs/ipccc-2026-abstract-draft_hk.docx,
which had been uncommitted since 2026-08-10. These are the author's own edits,
not agent edits, and are checkpointed here so they survive the deadline week.

Also records a standing warning on the coordination board: from 2026-08-19 the
manuscript is being edited in Overleaf, so paper/main.tex and paper/main.pdf in
this repo are stale until the author saves a final copy back. The warning tells
any later session to ask for the current Overleaf export rather than edit the
tree, which is the failure mode that turns into a three-way merge the week a
paper is due. Remove the warning when the final copy lands.

AI Assistant: Claude Opus 5
</commit_message>
<xml_diff>
--- a/docs/ipccc-2026-abstract-draft_hk.docx
+++ b/docs/ipccc-2026-abstract-draft_hk.docx
@@ -96,7 +96,14 @@
           <w:b/>
           <w:bCs/>
         </w:rPr>
-        <w:t>Bounded Authorization for Real-Time Robotic Systems: State- and Provenance-Aware NGAC in Reconfigurable Logic</w:t>
+        <w:t>Bounded Authorization for Real-Time Roboti</w:t>
+      </w:r>
+      <w:r>
+        <w:rPr>
+          <w:b/>
+          <w:bCs/>
+        </w:rPr>
+        <w:t>c Systems: State- and Provenance-Aware NGAC in Reconfigurable Logic</w:t>
       </w:r>
     </w:p>
     <w:p>
@@ -305,7 +312,10 @@
         <w:pStyle w:val="BlockText"/>
       </w:pPr>
       <w:r>
-        <w:t>Check how Badawy renders his name on recent papers (Abdel-Hameed A. Badawy vs Abdel-Hameed Badawy) and confirm the two remaining affiliations before submitting.</w:t>
+        <w:t>Check how Badawy renders his name on recent papers (Abdel-Hameed A. Badawy vs Abdel-Hameed Badawy) and confirm the two remaining affiliations before s</w:t>
+      </w:r>
+      <w:r>
+        <w:t>ubmitting.</w:t>
       </w:r>
     </w:p>
     <w:p>
@@ -323,130 +333,22 @@
         <w:pStyle w:val="BodyText"/>
       </w:pPr>
       <w:r>
-        <w:t xml:space="preserve">Real-time robotic systems </w:t>
-      </w:r>
-      <w:r>
-        <w:t xml:space="preserve">often neglect software-based </w:t>
-      </w:r>
-      <w:r>
-        <w:t xml:space="preserve">authorization </w:t>
-      </w:r>
-      <w:r>
-        <w:t xml:space="preserve">controls because prevailing controls don’t offer </w:t>
-      </w:r>
-      <w:r>
-        <w:t>decisions</w:t>
-      </w:r>
-      <w:r>
-        <w:t xml:space="preserve"> within a pre-determined cycle time.</w:t>
-      </w:r>
-      <w:r>
-        <w:t xml:space="preserve"> </w:t>
-      </w:r>
-      <w:r>
-        <w:t xml:space="preserve">software policy engines </w:t>
-      </w:r>
-      <w:r>
-        <w:t xml:space="preserve">create a </w:t>
-      </w:r>
-      <w:r>
-        <w:t xml:space="preserve">tail latency </w:t>
-      </w:r>
-      <w:r>
-        <w:t xml:space="preserve">that introduces </w:t>
-      </w:r>
-      <w:r>
-        <w:t>operating system</w:t>
-      </w:r>
-      <w:r>
-        <w:t xml:space="preserve"> contention, regardless of </w:t>
-      </w:r>
-      <w:r>
-        <w:t>policy</w:t>
-      </w:r>
-      <w:r>
-        <w:t xml:space="preserve"> decision speed</w:t>
-      </w:r>
-      <w:r>
-        <w:t>.</w:t>
-      </w:r>
-      <w:r>
-        <w:t xml:space="preserve"> In this article we present </w:t>
-      </w:r>
-      <w:r>
-        <w:t xml:space="preserve">H-NGAC, an authorization </w:t>
-      </w:r>
-      <w:r>
-        <w:t xml:space="preserve">method </w:t>
-      </w:r>
-      <w:r>
-        <w:t xml:space="preserve">that compiles </w:t>
-      </w:r>
-      <w:r>
-        <w:t xml:space="preserve">NIST </w:t>
-      </w:r>
-      <w:r>
-        <w:t>NGAC</w:t>
-      </w:r>
-      <w:r>
-        <w:t>-like (Next Generation Access Control)</w:t>
-      </w:r>
-      <w:r>
-        <w:t xml:space="preserve"> policy hypergraphs into fixed-width bitmasks</w:t>
-      </w:r>
-      <w:r>
-        <w:t>. Our method enables</w:t>
-      </w:r>
-      <w:r>
-        <w:t xml:space="preserve"> </w:t>
-      </w:r>
-      <w:r>
-        <w:t xml:space="preserve">hardware-based real-time </w:t>
-      </w:r>
-      <w:r>
-        <w:t>decision</w:t>
-      </w:r>
-      <w:r>
-        <w:t>s</w:t>
-      </w:r>
-      <w:r>
-        <w:t xml:space="preserve"> </w:t>
-      </w:r>
-      <w:r>
-        <w:t>via</w:t>
-      </w:r>
-      <w:r>
-        <w:t xml:space="preserve"> a chain of bitwise AND operations</w:t>
-      </w:r>
-      <w:r>
-        <w:t xml:space="preserve">. We </w:t>
-      </w:r>
-      <w:r>
+        <w:rPr>
+          <w:highlight w:val="green"/>
+        </w:rPr>
+        <w:t xml:space="preserve">Real-time robotic systems often neglect software-based authorization controls because prevailing controls don’t offer decisions within a pre-determined cycle time. software policy engines create a tail latency that introduces operating system contention, regardless of policy decision speed. In this article we present H-NGAC, an authorization method that compiles NIST NGAC-like (Next Generation Access Control) policy hypergraphs into fixed-width bitmasks. Our method enables hardware-based real-time decisions via a chain of bitwise AND operations. We </w:t>
+      </w:r>
+      <w:r>
+        <w:rPr>
+          <w:highlight w:val="green"/>
+        </w:rPr>
         <w:t>explore</w:t>
       </w:r>
       <w:r>
-        <w:t xml:space="preserve"> how </w:t>
-      </w:r>
-      <w:r>
-        <w:t>synthesiz</w:t>
-      </w:r>
-      <w:r>
-        <w:t>ing those decisions</w:t>
-      </w:r>
-      <w:r>
-        <w:t xml:space="preserve"> </w:t>
-      </w:r>
-      <w:r>
-        <w:t xml:space="preserve">in </w:t>
-      </w:r>
-      <w:r>
-        <w:t>reconfigurable logic</w:t>
-      </w:r>
-      <w:r>
-        <w:t xml:space="preserve"> impacts performance</w:t>
-      </w:r>
-      <w:r>
-        <w:t>.</w:t>
+        <w:rPr>
+          <w:highlight w:val="green"/>
+        </w:rPr>
+        <w:t xml:space="preserve"> how synthesizing those decisions in reconfigurable logic impacts performance.</w:t>
       </w:r>
     </w:p>
     <w:p>
@@ -457,20 +359,20 @@
         <w:rPr>
           <w:color w:val="FF0000"/>
         </w:rPr>
-        <w:t>Real-time robotic systems need authorization decisions with a bounded worst case, but software policy engines cannot offer one: their tail latency is governed by the operating system, not by the policy.</w:t>
-      </w:r>
-      <w:r>
-        <w:rPr>
-          <w:color w:val="FF0000"/>
-        </w:rPr>
-        <w:t xml:space="preserve"> We present H-NGAC, an authorization primitive that compiles NGAC policy hypergraphs into fixed-width </w:t>
+        <w:t xml:space="preserve">Real-time robotic systems need authorization decisions with a bounded worst case, but software policy engines cannot offer one: their tail latency is governed by the operating system, not by the policy. We present H-NGAC, an authorization primitive that compiles NGAC policy hypergraphs into fixed-width </w:t>
       </w:r>
       <w:r>
         <w:rPr>
           <w:color w:val="FF0000"/>
         </w:rPr>
         <w:lastRenderedPageBreak/>
-        <w:t>bitmasks so that a decision reduces to a chain of bitwise AND operations, and we synthesize it to reconfigurable logic.</w:t>
+        <w:t xml:space="preserve">bitmasks so that a decision reduces to a chain </w:t>
+      </w:r>
+      <w:r>
+        <w:rPr>
+          <w:color w:val="FF0000"/>
+        </w:rPr>
+        <w:t>of bitwise AND operations, and we synthesize it to reconfigurable logic.</w:t>
       </w:r>
       <w:r>
         <w:t xml:space="preserve"> </w:t>
@@ -489,10 +391,13 @@
         <w:pStyle w:val="BodyText"/>
       </w:pPr>
       <w:r>
-        <w:t xml:space="preserve">Our central result is that security dimensionality is free in time on an FPGA. Synthesized with Vitis HLS to a Zynq-7020 at 100 MHz, the four- and five-dimensional kernels resolve in an identical number of clock cycles at every policy size measured, with identical initiation interval and timing slack, and with minimum, mean and maximum latency exactly equal. Latency is closed-form at 12 + n/2 cycles for n rules, with zero jitter. The fifth dimension costs 524 additional LUTs and no BRAM or DSP, leaving the </w:t>
-      </w:r>
-      <w:r>
-        <w:t>primitive at 9% of a low-cost part. In software the same dimension is not free: per-rule cost rises from 0.645 to 1.220 cycles as dimensions are added. We verify 2,307 decisions on PYNQ-Z1 silicon and block 18,878 injection attempts in ROS 2 with no false positives.</w:t>
+        <w:t>Our central result is that s</w:t>
+      </w:r>
+      <w:r>
+        <w:t>ecurity dimensionality is free in time on an FPGA. Synthesized with Vitis HLS to a Zynq-7020 at 100 MHz, the four- and five-dimensional kernels resolve in an identical number of clock cycles at every policy size measured, with identical initiation interval and timing slack, and with minimum, mean and maximum latency exactly equal. Latency is closed-form at 12 + n/2 cycles for n rules, with zero jitter. The fifth dimension costs 524 additional LUTs and no BRAM or DSP, leaving the primitive at 9% of a low-cos</w:t>
+      </w:r>
+      <w:r>
+        <w:t>t part. In software the same dimension is not free: per-rule cost rises from 0.645 to 1.220 cycles as dimensions are added. We verify 2,307 decisions on PYNQ-Z1 silicon and block 18,878 injection attempts in ROS 2 with no false positives.</w:t>
       </w:r>
     </w:p>
     <w:p>
@@ -548,10 +453,7 @@
               <w:pStyle w:val="Compact"/>
             </w:pPr>
             <w:r>
-              <w:t>N</w:t>
-            </w:r>
-            <w:r>
-              <w:t>ot claimed</w:t>
+              <w:t>Not claimed</w:t>
             </w:r>
           </w:p>
         </w:tc>
@@ -592,7 +494,10 @@
               <w:pStyle w:val="Compact"/>
             </w:pPr>
             <w:r>
-              <w:t>The fifth dimension costs +11.4% LUT. It is free in time, nearly free in area.</w:t>
+              <w:t>The fifth dimension costs +11.4% LUT. It is free in time, near</w:t>
+            </w:r>
+            <w:r>
+              <w:t>ly free in area.</w:t>
             </w:r>
           </w:p>
         </w:tc>
@@ -722,10 +627,10 @@
         <w:t>Levers if you need to cut words.</w:t>
       </w:r>
       <w:r>
-        <w:t xml:space="preserve"> </w:t>
-      </w:r>
-      <w:r>
-        <w:t>The DDS-Security and SROS2 sentence is the most compressible; it can drop to a clause. The software comparison sentence (0.645 to 1.220) can go if you are tight, though it is what makes “free” meaningful by contrast.</w:t>
+        <w:t xml:space="preserve"> The DDS-Security and SROS2 sentenc</w:t>
+      </w:r>
+      <w:r>
+        <w:t>e is the most compressible; it can drop to a clause. The software comparison sentence (0.645 to 1.220) can go if you are tight, though it is what makes “free” meaningful by contrast.</w:t>
       </w:r>
     </w:p>
     <w:p>
@@ -740,10 +645,10 @@
         <w:t>Levers if you have room.</w:t>
       </w:r>
       <w:r>
-        <w:t xml:space="preserve"> Two additions would strengthen it. First, the OPA comparison from the withdrawn TS-NGAC work (OPA mean 271.491 microseconds, 13 deadline misses) preempts the “why not just use OPA” </w:t>
-      </w:r>
-      <w:r>
-        <w:t>question. Second, a sentence placing this in the hypergraph privilege-analysis line that began with the BigData 2025 paper, which is where the approach originated.</w:t>
+        <w:t xml:space="preserve"> Two additions would strengthen it. First, the OPA comparison from the withdrawn TS-NGAC work (OPA mean 271.491 microseconds, 13 deadline misses) preempts the “why not just use OPA” question. Second, a sentence placing this in the hypergraph privilege-analysis line that began with the BigData 2025 paper,</w:t>
+      </w:r>
+      <w:r>
+        <w:t xml:space="preserve"> which is where the approach originated.</w:t>
       </w:r>
     </w:p>
     <w:p>

</xml_diff>